<commit_message>
change to crop value and add pkg titles
</commit_message>
<xml_diff>
--- a/www/Questionaire for R Shiny.docx
+++ b/www/Questionaire for R Shiny.docx
@@ -269,7 +269,7 @@
               <w:rPr>
                 <w:lang w:val="en-GB"/>
               </w:rPr>
-              <w:t>losses</w:t>
+              <w:t>value</w:t>
             </w:r>
           </w:p>
         </w:tc>
@@ -1618,20 +1618,38 @@
         <w:rPr>
           <w:lang w:val="en-GB"/>
         </w:rPr>
-        <w:t>Crop losses</w:t>
-      </w:r>
-    </w:p>
-    <w:p>
-      <w:pPr>
-        <w:rPr>
-          <w:lang w:val="en-GB"/>
-        </w:rPr>
-      </w:pPr>
-      <w:r>
-        <w:rPr>
-          <w:lang w:val="en-GB"/>
-        </w:rPr>
-        <w:t>This is a measure of the success and therefore the acceptability of the yields and quality obtained using this technology/package.  The smaller the loss of yield and/or quality the greater the acceptability</w:t>
+        <w:t xml:space="preserve">Crop </w:t>
+      </w:r>
+      <w:r>
+        <w:rPr>
+          <w:lang w:val="en-GB"/>
+        </w:rPr>
+        <w:t>value</w:t>
+      </w:r>
+    </w:p>
+    <w:p>
+      <w:pPr>
+        <w:rPr>
+          <w:lang w:val="en-GB"/>
+        </w:rPr>
+      </w:pPr>
+      <w:r>
+        <w:rPr>
+          <w:lang w:val="en-GB"/>
+        </w:rPr>
+        <w:t xml:space="preserve">This is a measure of the success and therefore the acceptability of the yields and quality obtained.  The </w:t>
+      </w:r>
+      <w:r>
+        <w:rPr>
+          <w:lang w:val="en-GB"/>
+        </w:rPr>
+        <w:t>higher the</w:t>
+      </w:r>
+      <w:r>
+        <w:rPr>
+          <w:lang w:val="en-GB"/>
+        </w:rPr>
+        <w:t xml:space="preserve"> yield and/or quality the greater the acceptability</w:t>
       </w:r>
       <w:r>
         <w:rPr>
@@ -1930,13 +1948,6 @@
     </w:p>
     <w:p>
       <w:pPr>
-        <w:rPr>
-          <w:lang w:val="en-GB"/>
-        </w:rPr>
-      </w:pPr>
-    </w:p>
-    <w:p>
-      <w:pPr>
         <w:pStyle w:val="Heading1"/>
         <w:rPr>
           <w:lang w:val="en-GB"/>
@@ -2277,57 +2288,57 @@
         <w:rPr>
           <w:lang w:val="en-GB"/>
         </w:rPr>
+        <w:t>Does it require</w:t>
+      </w:r>
+      <w:r>
+        <w:rPr>
+          <w:lang w:val="en-GB"/>
+        </w:rPr>
+        <w:t xml:space="preserve"> time before the return on investment is realized,</w:t>
+      </w:r>
+      <w:r>
+        <w:rPr>
+          <w:lang w:val="en-GB"/>
+        </w:rPr>
+        <w:t xml:space="preserve"> or is it realized immediately,</w:t>
+      </w:r>
+      <w:r>
+        <w:rPr>
+          <w:lang w:val="en-GB"/>
+        </w:rPr>
+        <w:t xml:space="preserve"> for example </w:t>
+      </w:r>
+      <w:r>
+        <w:rPr>
+          <w:lang w:val="en-GB"/>
+        </w:rPr>
+        <w:t>planting of a diverse flowe</w:t>
+      </w:r>
+      <w:r>
+        <w:rPr>
+          <w:lang w:val="en-GB"/>
+        </w:rPr>
+        <w:t>r buffer versus re-establishing native habitat</w:t>
+      </w:r>
+      <w:r>
+        <w:rPr>
+          <w:lang w:val="en-GB"/>
+        </w:rPr>
+        <w:t>.</w:t>
+      </w:r>
+    </w:p>
+    <w:p>
+      <w:pPr>
+        <w:pStyle w:val="Heading1"/>
+        <w:rPr>
+          <w:lang w:val="en-GB"/>
+        </w:rPr>
+      </w:pPr>
+      <w:r>
+        <w:rPr>
+          <w:lang w:val="en-GB"/>
+        </w:rPr>
         <w:lastRenderedPageBreak/>
-        <w:t>Does it require</w:t>
-      </w:r>
-      <w:r>
-        <w:rPr>
-          <w:lang w:val="en-GB"/>
-        </w:rPr>
-        <w:t xml:space="preserve"> time before the return on investment is realized,</w:t>
-      </w:r>
-      <w:r>
-        <w:rPr>
-          <w:lang w:val="en-GB"/>
-        </w:rPr>
-        <w:t xml:space="preserve"> or is it realized immediately,</w:t>
-      </w:r>
-      <w:r>
-        <w:rPr>
-          <w:lang w:val="en-GB"/>
-        </w:rPr>
-        <w:t xml:space="preserve"> for example </w:t>
-      </w:r>
-      <w:r>
-        <w:rPr>
-          <w:lang w:val="en-GB"/>
-        </w:rPr>
-        <w:t>planting of a diverse flowe</w:t>
-      </w:r>
-      <w:r>
-        <w:rPr>
-          <w:lang w:val="en-GB"/>
-        </w:rPr>
-        <w:t>r buffer versus re-establishing native habitat</w:t>
-      </w:r>
-      <w:r>
-        <w:rPr>
-          <w:lang w:val="en-GB"/>
-        </w:rPr>
-        <w:t>.</w:t>
-      </w:r>
-    </w:p>
-    <w:p>
-      <w:pPr>
-        <w:pStyle w:val="Heading1"/>
-        <w:rPr>
-          <w:lang w:val="en-GB"/>
-        </w:rPr>
-      </w:pPr>
-      <w:r>
-        <w:rPr>
-          <w:lang w:val="en-GB"/>
-        </w:rPr>
         <w:t>Environmental impact</w:t>
       </w:r>
     </w:p>
@@ -2341,30 +2352,65 @@
         <w:rPr>
           <w:lang w:val="en-GB"/>
         </w:rPr>
-        <w:t xml:space="preserve">This is for factors </w:t>
-      </w:r>
-      <w:r>
-        <w:rPr>
-          <w:b/>
-          <w:bCs/>
-          <w:u w:val="single"/>
-          <w:lang w:val="en-GB"/>
-        </w:rPr>
-        <w:t>other</w:t>
-      </w:r>
-      <w:r>
-        <w:rPr>
-          <w:lang w:val="en-GB"/>
-        </w:rPr>
-        <w:t xml:space="preserve"> than any pesticides used as these are assessed and calculated from the pesticide application data using the Pesticide Impact Explorer (PIE) tool.  </w:t>
-      </w:r>
-    </w:p>
-    <w:p>
-      <w:pPr>
-        <w:rPr>
-          <w:lang w:val="en-GB"/>
-        </w:rPr>
-      </w:pPr>
+        <w:t>Please consider both the pesticides and non-</w:t>
+      </w:r>
+      <w:proofErr w:type="gramStart"/>
+      <w:r>
+        <w:rPr>
+          <w:lang w:val="en-GB"/>
+        </w:rPr>
+        <w:t>pesticide based</w:t>
+      </w:r>
+      <w:proofErr w:type="gramEnd"/>
+      <w:r>
+        <w:rPr>
+          <w:lang w:val="en-GB"/>
+        </w:rPr>
+        <w:t xml:space="preserve"> impacts in this assessment. The environmental costs from pesticides can be </w:t>
+      </w:r>
+      <w:r>
+        <w:rPr>
+          <w:lang w:val="en-GB"/>
+        </w:rPr>
+        <w:t>calculated from the pesticide application data using the Pesticide Impact Explorer (PIE) tool</w:t>
+      </w:r>
+      <w:r>
+        <w:rPr>
+          <w:lang w:val="en-GB"/>
+        </w:rPr>
+        <w:t xml:space="preserve">: </w:t>
+      </w:r>
+      <w:hyperlink r:id="rId12" w:history="1">
+        <w:r>
+          <w:rPr>
+            <w:rStyle w:val="Hyperlink"/>
+            <w:lang w:val="en-GB"/>
+          </w:rPr>
+          <w:t>agro.au.dk/</w:t>
+        </w:r>
+        <w:proofErr w:type="spellStart"/>
+        <w:r>
+          <w:rPr>
+            <w:rStyle w:val="Hyperlink"/>
+            <w:lang w:val="en-GB"/>
+          </w:rPr>
+          <w:t>pietool</w:t>
+        </w:r>
+        <w:proofErr w:type="spellEnd"/>
+      </w:hyperlink>
+    </w:p>
+    <w:p>
+      <w:pPr>
+        <w:rPr>
+          <w:lang w:val="en-GB"/>
+        </w:rPr>
+      </w:pPr>
+      <w:r>
+        <w:rPr>
+          <w:lang w:val="en-GB"/>
+        </w:rPr>
+        <w:t xml:space="preserve">.  </w:t>
+      </w:r>
       <w:r>
         <w:rPr>
           <w:lang w:val="en-GB"/>
@@ -2724,48 +2770,71 @@
         <w:rPr>
           <w:lang w:val="en-GB"/>
         </w:rPr>
-        <w:t>User health and safety</w:t>
-      </w:r>
-    </w:p>
-    <w:p>
-      <w:pPr>
-        <w:rPr>
-          <w:lang w:val="en-GB"/>
-        </w:rPr>
-      </w:pPr>
-      <w:r>
-        <w:rPr>
-          <w:lang w:val="en-GB"/>
-        </w:rPr>
-        <w:t xml:space="preserve">This is for factors </w:t>
-      </w:r>
-      <w:r>
-        <w:rPr>
-          <w:b/>
-          <w:bCs/>
-          <w:u w:val="single"/>
-          <w:lang w:val="en-GB"/>
-        </w:rPr>
-        <w:t>other</w:t>
-      </w:r>
-      <w:r>
-        <w:rPr>
-          <w:lang w:val="en-GB"/>
-        </w:rPr>
-        <w:t xml:space="preserve"> than any pesticides used as these are assessed and calculated from the pesticide application data using the Pesticide Impact Explorer (PIE) tool.  </w:t>
-      </w:r>
-    </w:p>
-    <w:p>
-      <w:pPr>
-        <w:rPr>
-          <w:lang w:val="en-GB"/>
-        </w:rPr>
-      </w:pPr>
-      <w:r>
-        <w:rPr>
-          <w:lang w:val="en-GB"/>
-        </w:rPr>
-        <w:t>Worker exposure to health and/or safety risks is:</w:t>
+        <w:t>Human health</w:t>
+      </w:r>
+    </w:p>
+    <w:p>
+      <w:pPr>
+        <w:rPr>
+          <w:lang w:val="en-GB"/>
+        </w:rPr>
+      </w:pPr>
+      <w:r>
+        <w:rPr>
+          <w:lang w:val="en-GB"/>
+        </w:rPr>
+        <w:t>Please consider both the pesticides and non-</w:t>
+      </w:r>
+      <w:proofErr w:type="gramStart"/>
+      <w:r>
+        <w:rPr>
+          <w:lang w:val="en-GB"/>
+        </w:rPr>
+        <w:t>pesticide based</w:t>
+      </w:r>
+      <w:proofErr w:type="gramEnd"/>
+      <w:r>
+        <w:rPr>
+          <w:lang w:val="en-GB"/>
+        </w:rPr>
+        <w:t xml:space="preserve"> impacts in this assessment. The human health costs from pesticides can be calculated from the pesticide application data using the Pesticide Impact Explorer (PIE) tool: </w:t>
+      </w:r>
+      <w:hyperlink r:id="rId13" w:history="1">
+        <w:r>
+          <w:rPr>
+            <w:rStyle w:val="Hyperlink"/>
+            <w:lang w:val="en-GB"/>
+          </w:rPr>
+          <w:t>agro.au.dk/</w:t>
+        </w:r>
+        <w:proofErr w:type="spellStart"/>
+        <w:r>
+          <w:rPr>
+            <w:rStyle w:val="Hyperlink"/>
+            <w:lang w:val="en-GB"/>
+          </w:rPr>
+          <w:t>pietool</w:t>
+        </w:r>
+        <w:proofErr w:type="spellEnd"/>
+      </w:hyperlink>
+    </w:p>
+    <w:p>
+      <w:pPr>
+        <w:rPr>
+          <w:lang w:val="en-GB"/>
+        </w:rPr>
+      </w:pPr>
+      <w:r>
+        <w:rPr>
+          <w:lang w:val="en-GB"/>
+        </w:rPr>
+        <w:t>Human health and safety risks are</w:t>
+      </w:r>
+      <w:r>
+        <w:rPr>
+          <w:lang w:val="en-GB"/>
+        </w:rPr>
+        <w:t>:</w:t>
       </w:r>
     </w:p>
     <w:tbl>
@@ -3052,21 +3121,21 @@
         <w:rPr>
           <w:lang w:val="en-GB"/>
         </w:rPr>
+        <w:t>You should think about health and safety issues not relating to the use of pesticides – there is an additional tool (Pesticide Impact Explorer (PIE) that allows you to enter the pesticide applications and get a numeric estimate of risk, as well as societal costs</w:t>
+      </w:r>
+    </w:p>
+    <w:p>
+      <w:pPr>
+        <w:pStyle w:val="Heading1"/>
+        <w:rPr>
+          <w:lang w:val="en-GB"/>
+        </w:rPr>
+      </w:pPr>
+      <w:r>
+        <w:rPr>
+          <w:lang w:val="en-GB"/>
+        </w:rPr>
         <w:lastRenderedPageBreak/>
-        <w:t>You should think about health and safety issues not relating to the use of pesticides – there is an additional tool (Pesticide Impact Explorer (PIE) that allows you to enter the pesticide applications and get a numeric estimate of risk, as well as societal costs</w:t>
-      </w:r>
-    </w:p>
-    <w:p>
-      <w:pPr>
-        <w:pStyle w:val="Heading1"/>
-        <w:rPr>
-          <w:lang w:val="en-GB"/>
-        </w:rPr>
-      </w:pPr>
-      <w:r>
-        <w:rPr>
-          <w:lang w:val="en-GB"/>
-        </w:rPr>
         <w:t>Time and management</w:t>
       </w:r>
     </w:p>
@@ -3403,13 +3472,6 @@
     </w:p>
     <w:p>
       <w:pPr>
-        <w:rPr>
-          <w:lang w:val="en-GB"/>
-        </w:rPr>
-      </w:pPr>
-    </w:p>
-    <w:p>
-      <w:pPr>
         <w:pStyle w:val="Heading1"/>
         <w:rPr>
           <w:lang w:val="en-GB"/>
@@ -3419,7 +3481,19 @@
         <w:rPr>
           <w:lang w:val="en-GB"/>
         </w:rPr>
-        <w:t>Third party coordination requirements</w:t>
+        <w:t>Third party coordination r</w:t>
+      </w:r>
+      <w:r>
+        <w:rPr>
+          <w:lang w:val="en-GB"/>
+        </w:rPr>
+        <w:t>e</w:t>
+      </w:r>
+      <w:r>
+        <w:rPr>
+          <w:lang w:val="en-GB"/>
+        </w:rPr>
+        <w:t>quirements</w:t>
       </w:r>
     </w:p>
     <w:p>
@@ -3776,7 +3850,6 @@
         <w:rPr>
           <w:lang w:val="en-GB"/>
         </w:rPr>
-        <w:lastRenderedPageBreak/>
         <w:t xml:space="preserve">Does the practice require </w:t>
       </w:r>
       <w:r>
@@ -3838,8 +3911,8 @@
       </w:pPr>
     </w:p>
     <w:sectPr>
-      <w:headerReference w:type="default" r:id="rId12"/>
-      <w:footerReference w:type="default" r:id="rId13"/>
+      <w:headerReference w:type="default" r:id="rId14"/>
+      <w:footerReference w:type="default" r:id="rId15"/>
       <w:pgSz w:w="11906" w:h="16838"/>
       <w:pgMar w:top="1440" w:right="1440" w:bottom="1440" w:left="1440" w:header="708" w:footer="708" w:gutter="0"/>
       <w:cols w:space="708"/>
@@ -3896,7 +3969,15 @@
     </w:r>
     <w:proofErr w:type="spellEnd"/>
     <w:r>
-      <w:t xml:space="preserve"> March 2026</w:t>
+      <w:t xml:space="preserve"> </w:t>
+    </w:r>
+    <w:proofErr w:type="gramStart"/>
+    <w:r>
+      <w:t>September</w:t>
+    </w:r>
+    <w:proofErr w:type="gramEnd"/>
+    <w:r>
+      <w:t xml:space="preserve"> 2026</w:t>
     </w:r>
   </w:p>
   <w:p>
@@ -3974,7 +4055,15 @@
         <w:iCs/>
         <w:lang w:val="en-US"/>
       </w:rPr>
-      <w:t>assessment of IPM package impacts</w:t>
+      <w:t xml:space="preserve">assessment of </w:t>
+    </w:r>
+    <w:r>
+      <w:rPr>
+        <w:i/>
+        <w:iCs/>
+        <w:lang w:val="en-US"/>
+      </w:rPr>
+      <w:t>crop production scenarios</w:t>
     </w:r>
   </w:p>
 </w:hdr>
@@ -6095,25 +6184,6 @@
 </file>
 
 <file path=customXml/item1.xml><?xml version="1.0" encoding="utf-8"?>
-<b:Sources xmlns:b="http://schemas.openxmlformats.org/officeDocument/2006/bibliography" xmlns="http://schemas.openxmlformats.org/officeDocument/2006/bibliography" SelectedStyle="/APASixthEditionOfficeOnline.xsl" StyleName="APA" Version="6"/>
-</file>
-
-<file path=customXml/item2.xml><?xml version="1.0" encoding="utf-8"?>
-<?mso-contentType ?>
-<FormTemplates xmlns="http://schemas.microsoft.com/sharepoint/v3/contenttype/forms">
-  <Display>DocumentLibraryForm</Display>
-  <Edit>DocumentLibraryForm</Edit>
-  <New>DocumentLibraryForm</New>
-</FormTemplates>
-</file>
-
-<file path=customXml/item3.xml><?xml version="1.0" encoding="utf-8"?>
-<p:properties xmlns:p="http://schemas.microsoft.com/office/2006/metadata/properties" xmlns:xsi="http://www.w3.org/2001/XMLSchema-instance" xmlns:pc="http://schemas.microsoft.com/office/infopath/2007/PartnerControls">
-  <documentManagement/>
-</p:properties>
-</file>
-
-<file path=customXml/item4.xml><?xml version="1.0" encoding="utf-8"?>
 <ct:contentTypeSchema xmlns:ct="http://schemas.microsoft.com/office/2006/metadata/contentType" xmlns:ma="http://schemas.microsoft.com/office/2006/metadata/properties/metaAttributes" ct:_="" ma:_="" ma:contentTypeName="Document" ma:contentTypeID="0x0101003C910C3F659AA248841421F8984B934B" ma:contentTypeVersion="0" ma:contentTypeDescription="Create a new document." ma:contentTypeScope="" ma:versionID="3cb03c21839d952800c78bcbdd9f4e8d">
   <xsd:schema xmlns:xsd="http://www.w3.org/2001/XMLSchema" xmlns:xs="http://www.w3.org/2001/XMLSchema" xmlns:p="http://schemas.microsoft.com/office/2006/metadata/properties" targetNamespace="http://schemas.microsoft.com/office/2006/metadata/properties" ma:root="true" ma:fieldsID="27b4a4f76bea50102067bc7ec8c6d4d1">
     <xsd:element name="properties">
@@ -6227,32 +6297,26 @@
 </ct:contentTypeSchema>
 </file>
 
-<file path=customXml/itemProps1.xml><?xml version="1.0" encoding="utf-8"?>
-<ds:datastoreItem xmlns:ds="http://schemas.openxmlformats.org/officeDocument/2006/customXml" ds:itemID="{1AD084C8-B4E8-7C4B-8770-2FD3E39029B7}">
-  <ds:schemaRefs>
-    <ds:schemaRef ds:uri="http://schemas.openxmlformats.org/officeDocument/2006/bibliography"/>
-  </ds:schemaRefs>
-</ds:datastoreItem>
+<file path=customXml/item2.xml><?xml version="1.0" encoding="utf-8"?>
+<b:Sources xmlns:b="http://schemas.openxmlformats.org/officeDocument/2006/bibliography" xmlns="http://schemas.openxmlformats.org/officeDocument/2006/bibliography" SelectedStyle="/APASixthEditionOfficeOnline.xsl" StyleName="APA" Version="6"/>
 </file>
 
-<file path=customXml/itemProps2.xml><?xml version="1.0" encoding="utf-8"?>
-<ds:datastoreItem xmlns:ds="http://schemas.openxmlformats.org/officeDocument/2006/customXml" ds:itemID="{5ABC6505-7F7A-4A83-90A0-0745D8382E2C}">
-  <ds:schemaRefs>
-    <ds:schemaRef ds:uri="http://schemas.microsoft.com/sharepoint/v3/contenttype/forms"/>
-  </ds:schemaRefs>
-</ds:datastoreItem>
+<file path=customXml/item3.xml><?xml version="1.0" encoding="utf-8"?>
+<?mso-contentType ?>
+<FormTemplates xmlns="http://schemas.microsoft.com/sharepoint/v3/contenttype/forms">
+  <Display>DocumentLibraryForm</Display>
+  <Edit>DocumentLibraryForm</Edit>
+  <New>DocumentLibraryForm</New>
+</FormTemplates>
 </file>
 
-<file path=customXml/itemProps3.xml><?xml version="1.0" encoding="utf-8"?>
-<ds:datastoreItem xmlns:ds="http://schemas.openxmlformats.org/officeDocument/2006/customXml" ds:itemID="{97EAD5F6-2DD9-4190-8589-C1BA867A8AE6}">
-  <ds:schemaRefs>
-    <ds:schemaRef ds:uri="http://schemas.microsoft.com/office/2006/metadata/properties"/>
-    <ds:schemaRef ds:uri="http://schemas.microsoft.com/office/infopath/2007/PartnerControls"/>
-  </ds:schemaRefs>
-</ds:datastoreItem>
+<file path=customXml/item4.xml><?xml version="1.0" encoding="utf-8"?>
+<p:properties xmlns:p="http://schemas.microsoft.com/office/2006/metadata/properties" xmlns:xsi="http://www.w3.org/2001/XMLSchema-instance" xmlns:pc="http://schemas.microsoft.com/office/infopath/2007/PartnerControls">
+  <documentManagement/>
+</p:properties>
 </file>
 
-<file path=customXml/itemProps4.xml><?xml version="1.0" encoding="utf-8"?>
+<file path=customXml/itemProps1.xml><?xml version="1.0" encoding="utf-8"?>
 <ds:datastoreItem xmlns:ds="http://schemas.openxmlformats.org/officeDocument/2006/customXml" ds:itemID="{4CD770F1-EA2B-496E-8056-64D82FB53FAA}">
   <ds:schemaRefs>
     <ds:schemaRef ds:uri="http://schemas.microsoft.com/office/2006/metadata/contentType"/>
@@ -6268,6 +6332,31 @@
 </ds:datastoreItem>
 </file>
 
+<file path=customXml/itemProps2.xml><?xml version="1.0" encoding="utf-8"?>
+<ds:datastoreItem xmlns:ds="http://schemas.openxmlformats.org/officeDocument/2006/customXml" ds:itemID="{1AD084C8-B4E8-7C4B-8770-2FD3E39029B7}">
+  <ds:schemaRefs>
+    <ds:schemaRef ds:uri="http://schemas.openxmlformats.org/officeDocument/2006/bibliography"/>
+  </ds:schemaRefs>
+</ds:datastoreItem>
+</file>
+
+<file path=customXml/itemProps3.xml><?xml version="1.0" encoding="utf-8"?>
+<ds:datastoreItem xmlns:ds="http://schemas.openxmlformats.org/officeDocument/2006/customXml" ds:itemID="{5ABC6505-7F7A-4A83-90A0-0745D8382E2C}">
+  <ds:schemaRefs>
+    <ds:schemaRef ds:uri="http://schemas.microsoft.com/sharepoint/v3/contenttype/forms"/>
+  </ds:schemaRefs>
+</ds:datastoreItem>
+</file>
+
+<file path=customXml/itemProps4.xml><?xml version="1.0" encoding="utf-8"?>
+<ds:datastoreItem xmlns:ds="http://schemas.openxmlformats.org/officeDocument/2006/customXml" ds:itemID="{97EAD5F6-2DD9-4190-8589-C1BA867A8AE6}">
+  <ds:schemaRefs>
+    <ds:schemaRef ds:uri="http://schemas.microsoft.com/office/2006/metadata/properties"/>
+    <ds:schemaRef ds:uri="http://schemas.microsoft.com/office/infopath/2007/PartnerControls"/>
+  </ds:schemaRefs>
+</ds:datastoreItem>
+</file>
+
 <file path=docMetadata/LabelInfo.xml><?xml version="1.0" encoding="utf-8"?>
 <clbl:labelList xmlns:clbl="http://schemas.microsoft.com/office/2020/mipLabelMetadata">
   <clbl:label id="{61fd1d36-fecb-47ca-b7d7-d0df0370a198}" enabled="0" method="" siteId="{61fd1d36-fecb-47ca-b7d7-d0df0370a198}" removed="1"/>

</xml_diff>

<commit_message>
update text and human health label
</commit_message>
<xml_diff>
--- a/www/Questionaire for R Shiny.docx
+++ b/www/Questionaire for R Shiny.docx
@@ -401,13 +401,7 @@
               <w:rPr>
                 <w:lang w:val="en-GB"/>
               </w:rPr>
-              <w:t>User h</w:t>
-            </w:r>
-            <w:r>
-              <w:rPr>
-                <w:lang w:val="en-GB"/>
-              </w:rPr>
-              <w:t>ealth and safety</w:t>
+              <w:t>Human health and safety</w:t>
             </w:r>
           </w:p>
         </w:tc>
@@ -2771,6 +2765,12 @@
           <w:lang w:val="en-GB"/>
         </w:rPr>
         <w:t>Human health</w:t>
+      </w:r>
+      <w:r>
+        <w:rPr>
+          <w:lang w:val="en-GB"/>
+        </w:rPr>
+        <w:t xml:space="preserve"> and safety</w:t>
       </w:r>
     </w:p>
     <w:p>
@@ -6184,6 +6184,10 @@
 </file>
 
 <file path=customXml/item1.xml><?xml version="1.0" encoding="utf-8"?>
+<b:Sources xmlns:b="http://schemas.openxmlformats.org/officeDocument/2006/bibliography" xmlns="http://schemas.openxmlformats.org/officeDocument/2006/bibliography" SelectedStyle="/APASixthEditionOfficeOnline.xsl" StyleName="APA" Version="6"/>
+</file>
+
+<file path=customXml/item2.xml><?xml version="1.0" encoding="utf-8"?>
 <ct:contentTypeSchema xmlns:ct="http://schemas.microsoft.com/office/2006/metadata/contentType" xmlns:ma="http://schemas.microsoft.com/office/2006/metadata/properties/metaAttributes" ct:_="" ma:_="" ma:contentTypeName="Document" ma:contentTypeID="0x0101003C910C3F659AA248841421F8984B934B" ma:contentTypeVersion="0" ma:contentTypeDescription="Create a new document." ma:contentTypeScope="" ma:versionID="3cb03c21839d952800c78bcbdd9f4e8d">
   <xsd:schema xmlns:xsd="http://www.w3.org/2001/XMLSchema" xmlns:xs="http://www.w3.org/2001/XMLSchema" xmlns:p="http://schemas.microsoft.com/office/2006/metadata/properties" targetNamespace="http://schemas.microsoft.com/office/2006/metadata/properties" ma:root="true" ma:fieldsID="27b4a4f76bea50102067bc7ec8c6d4d1">
     <xsd:element name="properties">
@@ -6297,11 +6301,13 @@
 </ct:contentTypeSchema>
 </file>
 
-<file path=customXml/item2.xml><?xml version="1.0" encoding="utf-8"?>
-<b:Sources xmlns:b="http://schemas.openxmlformats.org/officeDocument/2006/bibliography" xmlns="http://schemas.openxmlformats.org/officeDocument/2006/bibliography" SelectedStyle="/APASixthEditionOfficeOnline.xsl" StyleName="APA" Version="6"/>
+<file path=customXml/item3.xml><?xml version="1.0" encoding="utf-8"?>
+<p:properties xmlns:p="http://schemas.microsoft.com/office/2006/metadata/properties" xmlns:xsi="http://www.w3.org/2001/XMLSchema-instance" xmlns:pc="http://schemas.microsoft.com/office/infopath/2007/PartnerControls">
+  <documentManagement/>
+</p:properties>
 </file>
 
-<file path=customXml/item3.xml><?xml version="1.0" encoding="utf-8"?>
+<file path=customXml/item4.xml><?xml version="1.0" encoding="utf-8"?>
 <?mso-contentType ?>
 <FormTemplates xmlns="http://schemas.microsoft.com/sharepoint/v3/contenttype/forms">
   <Display>DocumentLibraryForm</Display>
@@ -6310,13 +6316,15 @@
 </FormTemplates>
 </file>
 
-<file path=customXml/item4.xml><?xml version="1.0" encoding="utf-8"?>
-<p:properties xmlns:p="http://schemas.microsoft.com/office/2006/metadata/properties" xmlns:xsi="http://www.w3.org/2001/XMLSchema-instance" xmlns:pc="http://schemas.microsoft.com/office/infopath/2007/PartnerControls">
-  <documentManagement/>
-</p:properties>
+<file path=customXml/itemProps1.xml><?xml version="1.0" encoding="utf-8"?>
+<ds:datastoreItem xmlns:ds="http://schemas.openxmlformats.org/officeDocument/2006/customXml" ds:itemID="{1AD084C8-B4E8-7C4B-8770-2FD3E39029B7}">
+  <ds:schemaRefs>
+    <ds:schemaRef ds:uri="http://schemas.openxmlformats.org/officeDocument/2006/bibliography"/>
+  </ds:schemaRefs>
+</ds:datastoreItem>
 </file>
 
-<file path=customXml/itemProps1.xml><?xml version="1.0" encoding="utf-8"?>
+<file path=customXml/itemProps2.xml><?xml version="1.0" encoding="utf-8"?>
 <ds:datastoreItem xmlns:ds="http://schemas.openxmlformats.org/officeDocument/2006/customXml" ds:itemID="{4CD770F1-EA2B-496E-8056-64D82FB53FAA}">
   <ds:schemaRefs>
     <ds:schemaRef ds:uri="http://schemas.microsoft.com/office/2006/metadata/contentType"/>
@@ -6332,27 +6340,19 @@
 </ds:datastoreItem>
 </file>
 
-<file path=customXml/itemProps2.xml><?xml version="1.0" encoding="utf-8"?>
-<ds:datastoreItem xmlns:ds="http://schemas.openxmlformats.org/officeDocument/2006/customXml" ds:itemID="{1AD084C8-B4E8-7C4B-8770-2FD3E39029B7}">
+<file path=customXml/itemProps3.xml><?xml version="1.0" encoding="utf-8"?>
+<ds:datastoreItem xmlns:ds="http://schemas.openxmlformats.org/officeDocument/2006/customXml" ds:itemID="{97EAD5F6-2DD9-4190-8589-C1BA867A8AE6}">
   <ds:schemaRefs>
-    <ds:schemaRef ds:uri="http://schemas.openxmlformats.org/officeDocument/2006/bibliography"/>
-  </ds:schemaRefs>
-</ds:datastoreItem>
-</file>
-
-<file path=customXml/itemProps3.xml><?xml version="1.0" encoding="utf-8"?>
-<ds:datastoreItem xmlns:ds="http://schemas.openxmlformats.org/officeDocument/2006/customXml" ds:itemID="{5ABC6505-7F7A-4A83-90A0-0745D8382E2C}">
-  <ds:schemaRefs>
-    <ds:schemaRef ds:uri="http://schemas.microsoft.com/sharepoint/v3/contenttype/forms"/>
+    <ds:schemaRef ds:uri="http://schemas.microsoft.com/office/2006/metadata/properties"/>
+    <ds:schemaRef ds:uri="http://schemas.microsoft.com/office/infopath/2007/PartnerControls"/>
   </ds:schemaRefs>
 </ds:datastoreItem>
 </file>
 
 <file path=customXml/itemProps4.xml><?xml version="1.0" encoding="utf-8"?>
-<ds:datastoreItem xmlns:ds="http://schemas.openxmlformats.org/officeDocument/2006/customXml" ds:itemID="{97EAD5F6-2DD9-4190-8589-C1BA867A8AE6}">
+<ds:datastoreItem xmlns:ds="http://schemas.openxmlformats.org/officeDocument/2006/customXml" ds:itemID="{5ABC6505-7F7A-4A83-90A0-0745D8382E2C}">
   <ds:schemaRefs>
-    <ds:schemaRef ds:uri="http://schemas.microsoft.com/office/2006/metadata/properties"/>
-    <ds:schemaRef ds:uri="http://schemas.microsoft.com/office/infopath/2007/PartnerControls"/>
+    <ds:schemaRef ds:uri="http://schemas.microsoft.com/sharepoint/v3/contenttype/forms"/>
   </ds:schemaRefs>
 </ds:datastoreItem>
 </file>

</xml_diff>